<commit_message>
SGS venta: propuesta comercial v1.1 (videovigilancia, IA, NFC/geocerca)
Actualiza la propuesta de valor con lo agregado al sistema:
- Videovigilancia (muro de camaras, camaras cercanas a incidencia).
- Copiloto con IA (novedades por cliente/sitio, en lenguaje natural).
- Rondin QR/NFC + geocerca (anti-fraude) en vez de solo QR+GPS.
- Monitoreo en vivo multicapa (incluye camaras y estatus del guardia).
Nuevas filas en la tabla de capacidades y diferenciadores. Version 1.1.

Co-Authored-By: Claude Opus 4.8 <noreply@anthropic.com>
</commit_message>
<xml_diff>
--- a/docs/venta/SGS-Propuesta-Comercial.docx
+++ b/docs/venta/SGS-Propuesta-Comercial.docx
@@ -91,7 +91,7 @@
           <w:sz w:val="21"/>
           <w:szCs w:val="21"/>
         </w:rPr>
-        <w:t xml:space="preserve">Rondines verificables · Monitoreo en vivo · Despacho y alertas · Supervisión y reportes</w:t>
+        <w:t xml:space="preserve">Rondines verificables · Monitoreo en vivo · Videovigilancia · Despacho y alertas · Asistente con IA</w:t>
       </w:r>
     </w:p>
     <w:p>
@@ -114,7 +114,7 @@
           <w:sz w:val="20"/>
           <w:szCs w:val="20"/>
         </w:rPr>
-        <w:t xml:space="preserve">Versión 1.0 · Agosto 2026</w:t>
+        <w:t xml:space="preserve">Versión 1.1 · Agosto 2026</w:t>
       </w:r>
     </w:p>
     <w:p>
@@ -189,7 +189,7 @@
           <w:sz w:val="21"/>
           <w:szCs w:val="21"/>
         </w:rPr>
-        <w:t xml:space="preserve">SGS (Sistema de Gestión de Seguridad) es una plataforma que digitaliza y controla, de principio a fin, la operación de una empresa de seguridad privada. Reúne en una sola herramienta el rondín verificable, el monitoreo en tiempo real, la respuesta a emergencias con video en vivo, la supervisión con reportes y la gestión de clientes, sitios, guardias y turnos.</w:t>
+        <w:t xml:space="preserve">SGS (Sistema de Gestión de Seguridad) es una plataforma que digitaliza y controla, de principio a fin, la operación de una empresa de seguridad privada. Reúne en una sola herramienta el rondín verificable (QR/NFC con validación por GPS), el monitoreo en tiempo real, la videovigilancia de las cámaras del sitio, la respuesta a emergencias con video en vivo, la supervisión con reportes, un asistente con inteligencia artificial y la gestión de clientes, sitios, guardias y turnos.</w:t>
       </w:r>
     </w:p>
     <w:p>
@@ -486,15 +486,15 @@
           <w:sz w:val="21"/>
           <w:szCs w:val="21"/>
         </w:rPr>
-        <w:t xml:space="preserve">Rondines verificables con QR + GPS. </w:t>
-      </w:r>
-      <w:r>
-        <w:rPr>
-          <w:color w:val="222222"/>
-          <w:sz w:val="21"/>
-          <w:szCs w:val="21"/>
-        </w:rPr>
-        <w:t xml:space="preserve">El guardia escanea el código del punto y el sistema registra hora y ubicación: evidencia real de que estuvo ahí.</w:t>
+        <w:t xml:space="preserve">Rondines verificables con QR/NFC + geocerca. </w:t>
+      </w:r>
+      <w:r>
+        <w:rPr>
+          <w:color w:val="222222"/>
+          <w:sz w:val="21"/>
+          <w:szCs w:val="21"/>
+        </w:rPr>
+        <w:t xml:space="preserve">El guardia lee el punto por QR o etiqueta NFC y el sistema valida con GPS que realmente estaba ahí (dentro del radio del punto); los intentos fuera de rango quedan marcados. Control anti-fraude con evidencia real.</w:t>
       </w:r>
     </w:p>
     <w:p>
@@ -520,15 +520,15 @@
           <w:sz w:val="21"/>
           <w:szCs w:val="21"/>
         </w:rPr>
-        <w:t xml:space="preserve">Monitoreo en vivo. </w:t>
-      </w:r>
-      <w:r>
-        <w:rPr>
-          <w:color w:val="222222"/>
-          <w:sz w:val="21"/>
-          <w:szCs w:val="21"/>
-        </w:rPr>
-        <w:t xml:space="preserve">La central ve en un mapa a sus guardias y sitios en tiempo real.</w:t>
+        <w:t xml:space="preserve">Monitoreo en vivo multicapa. </w:t>
+      </w:r>
+      <w:r>
+        <w:rPr>
+          <w:color w:val="222222"/>
+          <w:sz w:val="21"/>
+          <w:szCs w:val="21"/>
+        </w:rPr>
+        <w:t xml:space="preserve">La central ve en un mapa a sus guardias (con su estatus), sitios, puntos de control, incidencias y cámaras, en tiempo real y sin perder el foco al actualizarse.</w:t>
       </w:r>
     </w:p>
     <w:p>
@@ -554,15 +554,15 @@
           <w:sz w:val="21"/>
           <w:szCs w:val="21"/>
         </w:rPr>
-        <w:t xml:space="preserve">Respuesta inmediata a emergencias. </w:t>
-      </w:r>
-      <w:r>
-        <w:rPr>
-          <w:color w:val="222222"/>
-          <w:sz w:val="21"/>
-          <w:szCs w:val="21"/>
-        </w:rPr>
-        <w:t xml:space="preserve">Botón de alerta que abre un despacho con ubicación y transmisión de video en vivo.</w:t>
+        <w:t xml:space="preserve">Videovigilancia integrada. </w:t>
+      </w:r>
+      <w:r>
+        <w:rPr>
+          <w:color w:val="222222"/>
+          <w:sz w:val="21"/>
+          <w:szCs w:val="21"/>
+        </w:rPr>
+        <w:t xml:space="preserve">Las cámaras fijas (CCTV) de cada sitio se ven en un muro en vivo (hasta 24, con pantalla completa) y se ofrecen automáticamente cerca de cada incidencia. El video no se almacena: la señal se resuelve al momento.</w:t>
       </w:r>
     </w:p>
     <w:p>
@@ -588,6 +588,40 @@
           <w:sz w:val="21"/>
           <w:szCs w:val="21"/>
         </w:rPr>
+        <w:t xml:space="preserve">Respuesta inmediata a emergencias. </w:t>
+      </w:r>
+      <w:r>
+        <w:rPr>
+          <w:color w:val="222222"/>
+          <w:sz w:val="21"/>
+          <w:szCs w:val="21"/>
+        </w:rPr>
+        <w:t xml:space="preserve">Botón de alerta que abre un despacho con ubicación y transmisión de video en vivo.</w:t>
+      </w:r>
+    </w:p>
+    <w:p>
+      <w:pPr>
+        <w:spacing w:after="80" w:line="272"/>
+        <w:ind w:left="360" w:hanging="300"/>
+      </w:pPr>
+      <w:r>
+        <w:rPr>
+          <w:b/>
+          <w:bCs/>
+          <w:color w:val="3E7470"/>
+          <w:sz w:val="22"/>
+          <w:szCs w:val="22"/>
+        </w:rPr>
+        <w:t xml:space="preserve">✓  </w:t>
+      </w:r>
+      <w:r>
+        <w:rPr>
+          <w:b/>
+          <w:bCs/>
+          <w:color w:val="222222"/>
+          <w:sz w:val="21"/>
+          <w:szCs w:val="21"/>
+        </w:rPr>
         <w:t xml:space="preserve">Supervisión y reportes para el cliente. </w:t>
       </w:r>
       <w:r>
@@ -597,6 +631,40 @@
           <w:szCs w:val="21"/>
         </w:rPr>
         <w:t xml:space="preserve">Recorrido de cada rondín en mapa y línea de tiempo, exportable a PDF.</w:t>
+      </w:r>
+    </w:p>
+    <w:p>
+      <w:pPr>
+        <w:spacing w:after="80" w:line="272"/>
+        <w:ind w:left="360" w:hanging="300"/>
+      </w:pPr>
+      <w:r>
+        <w:rPr>
+          <w:b/>
+          <w:bCs/>
+          <w:color w:val="3E7470"/>
+          <w:sz w:val="22"/>
+          <w:szCs w:val="22"/>
+        </w:rPr>
+        <w:t xml:space="preserve">✓  </w:t>
+      </w:r>
+      <w:r>
+        <w:rPr>
+          <w:b/>
+          <w:bCs/>
+          <w:color w:val="222222"/>
+          <w:sz w:val="21"/>
+          <w:szCs w:val="21"/>
+        </w:rPr>
+        <w:t xml:space="preserve">Asistente con inteligencia artificial. </w:t>
+      </w:r>
+      <w:r>
+        <w:rPr>
+          <w:color w:val="222222"/>
+          <w:sz w:val="21"/>
+          <w:szCs w:val="21"/>
+        </w:rPr>
+        <w:t xml:space="preserve">Responde en lenguaje natural preguntas sobre la operación —por ejemplo, las novedades de un cliente o de un sitio— a partir de los propios registros y citando su origen.</w:t>
       </w:r>
     </w:p>
     <w:p>
@@ -823,7 +891,7 @@
                 <w:sz w:val="20"/>
                 <w:szCs w:val="20"/>
               </w:rPr>
-              <w:t xml:space="preserve">Rondines con QR y GPS</w:t>
+              <w:t xml:space="preserve">Rondines con QR/NFC y geocerca</w:t>
             </w:r>
           </w:p>
         </w:tc>
@@ -847,7 +915,7 @@
                 <w:sz w:val="20"/>
                 <w:szCs w:val="20"/>
               </w:rPr>
-              <w:t xml:space="preserve">Comprueba y documenta cada recorrido; elimina el “rondín de papel”.</w:t>
+              <w:t xml:space="preserve">Comprueba cada recorrido y valida por GPS que el guardia estuvo en el punto; marca los intentos fuera de rango (anti-fraude).</w:t>
             </w:r>
           </w:p>
         </w:tc>
@@ -873,7 +941,7 @@
                 <w:sz w:val="20"/>
                 <w:szCs w:val="20"/>
               </w:rPr>
-              <w:t xml:space="preserve">Monitoreo GPS en vivo</w:t>
+              <w:t xml:space="preserve">Monitoreo en vivo multicapa</w:t>
             </w:r>
           </w:p>
         </w:tc>
@@ -897,7 +965,7 @@
                 <w:sz w:val="20"/>
                 <w:szCs w:val="20"/>
               </w:rPr>
-              <w:t xml:space="preserve">Visibilidad inmediata de guardias y sitios; mejor toma de decisiones.</w:t>
+              <w:t xml:space="preserve">Guardias (con su estatus), sitios, puntos, incidencias y cámaras en un mapa en tiempo real.</w:t>
             </w:r>
           </w:p>
         </w:tc>
@@ -923,7 +991,7 @@
                 <w:sz w:val="20"/>
                 <w:szCs w:val="20"/>
               </w:rPr>
-              <w:t xml:space="preserve">Central / Despacho y Alertas</w:t>
+              <w:t xml:space="preserve">Videovigilancia (cámaras)</w:t>
             </w:r>
           </w:p>
         </w:tc>
@@ -947,7 +1015,7 @@
                 <w:sz w:val="20"/>
                 <w:szCs w:val="20"/>
               </w:rPr>
-              <w:t xml:space="preserve">Atención de incidencias y emergencias con video en vivo y seguimiento.</w:t>
+              <w:t xml:space="preserve">Muro en vivo de las cámaras del sitio y cámaras cercanas a cada incidencia; sin almacenar video.</w:t>
             </w:r>
           </w:p>
         </w:tc>
@@ -973,7 +1041,7 @@
                 <w:sz w:val="20"/>
                 <w:szCs w:val="20"/>
               </w:rPr>
-              <w:t xml:space="preserve">Supervisión de rondín</w:t>
+              <w:t xml:space="preserve">Central / Despacho y Alertas</w:t>
             </w:r>
           </w:p>
         </w:tc>
@@ -997,7 +1065,7 @@
                 <w:sz w:val="20"/>
                 <w:szCs w:val="20"/>
               </w:rPr>
-              <w:t xml:space="preserve">Recorrido en mapa y línea de tiempo, con reporte PDF para el cliente.</w:t>
+              <w:t xml:space="preserve">Atención de incidencias y emergencias con video en vivo y seguimiento.</w:t>
             </w:r>
           </w:p>
         </w:tc>
@@ -1023,7 +1091,7 @@
                 <w:sz w:val="20"/>
                 <w:szCs w:val="20"/>
               </w:rPr>
-              <w:t xml:space="preserve">Rol de turnos</w:t>
+              <w:t xml:space="preserve">Supervisión de rondín</w:t>
             </w:r>
           </w:p>
         </w:tc>
@@ -1047,7 +1115,7 @@
                 <w:sz w:val="20"/>
                 <w:szCs w:val="20"/>
               </w:rPr>
-              <w:t xml:space="preserve">Planeación clara: supervisor, guardias y sitios por jornada.</w:t>
+              <w:t xml:space="preserve">Recorrido en mapa y línea de tiempo, con reporte PDF para el cliente.</w:t>
             </w:r>
           </w:p>
         </w:tc>
@@ -1073,7 +1141,7 @@
                 <w:sz w:val="20"/>
                 <w:szCs w:val="20"/>
               </w:rPr>
-              <w:t xml:space="preserve">Tareas con notificación</w:t>
+              <w:t xml:space="preserve">Rol de turnos</w:t>
             </w:r>
           </w:p>
         </w:tc>
@@ -1097,7 +1165,7 @@
                 <w:sz w:val="20"/>
                 <w:szCs w:val="20"/>
               </w:rPr>
-              <w:t xml:space="preserve">Instrucciones al guardia con acuse y seguimiento en tiempo real.</w:t>
+              <w:t xml:space="preserve">Planeación clara: supervisor, guardias y sitios por jornada.</w:t>
             </w:r>
           </w:p>
         </w:tc>
@@ -1123,7 +1191,7 @@
                 <w:sz w:val="20"/>
                 <w:szCs w:val="20"/>
               </w:rPr>
-              <w:t xml:space="preserve">Evidencias y bodycam</w:t>
+              <w:t xml:space="preserve">Tareas con notificación</w:t>
             </w:r>
           </w:p>
         </w:tc>
@@ -1147,7 +1215,7 @@
                 <w:sz w:val="20"/>
                 <w:szCs w:val="20"/>
               </w:rPr>
-              <w:t xml:space="preserve">Fotos y video con cadena de custodia; respaldo ante reclamos.</w:t>
+              <w:t xml:space="preserve">Instrucciones al guardia con acuse y seguimiento en tiempo real.</w:t>
             </w:r>
           </w:p>
         </w:tc>
@@ -1173,7 +1241,7 @@
                 <w:sz w:val="20"/>
                 <w:szCs w:val="20"/>
               </w:rPr>
-              <w:t xml:space="preserve">Clientes, sitios y guardias</w:t>
+              <w:t xml:space="preserve">Evidencias y bodycam</w:t>
             </w:r>
           </w:p>
         </w:tc>
@@ -1197,7 +1265,7 @@
                 <w:sz w:val="20"/>
                 <w:szCs w:val="20"/>
               </w:rPr>
-              <w:t xml:space="preserve">Toda la operación organizada y lista para reportar.</w:t>
+              <w:t xml:space="preserve">Fotos y video con cadena de custodia; respaldo ante reclamos.</w:t>
             </w:r>
           </w:p>
         </w:tc>
@@ -1223,7 +1291,7 @@
                 <w:sz w:val="20"/>
                 <w:szCs w:val="20"/>
               </w:rPr>
-              <w:t xml:space="preserve">Tablero e indicadores</w:t>
+              <w:t xml:space="preserve">Copiloto con IA</w:t>
             </w:r>
           </w:p>
         </w:tc>
@@ -1247,6 +1315,106 @@
                 <w:sz w:val="20"/>
                 <w:szCs w:val="20"/>
               </w:rPr>
+              <w:t xml:space="preserve">Respuestas en lenguaje natural sobre la operación (novedades por cliente/sitio) a partir de los registros.</w:t>
+            </w:r>
+          </w:p>
+        </w:tc>
+      </w:tr>
+      <w:tr>
+        <w:tc>
+          <w:tcPr>
+            <w:tcW w:type="dxa" w:w="3000"/>
+            <w:shd w:fill="EEF1F4" w:color="auto" w:val="clear"/>
+            <w:tcMar>
+              <w:top w:type="dxa" w:w="55"/>
+              <w:left w:type="dxa" w:w="110"/>
+              <w:bottom w:type="dxa" w:w="55"/>
+              <w:right w:type="dxa" w:w="110"/>
+            </w:tcMar>
+          </w:tcPr>
+          <w:p>
+            <w:r>
+              <w:rPr>
+                <w:b/>
+                <w:bCs/>
+                <w:color w:val="222222"/>
+                <w:sz w:val="20"/>
+                <w:szCs w:val="20"/>
+              </w:rPr>
+              <w:t xml:space="preserve">Clientes, sitios y guardias</w:t>
+            </w:r>
+          </w:p>
+        </w:tc>
+        <w:tc>
+          <w:tcPr>
+            <w:tcW w:type="dxa" w:w="6360"/>
+            <w:shd w:fill="EEF1F4" w:color="auto" w:val="clear"/>
+            <w:tcMar>
+              <w:top w:type="dxa" w:w="55"/>
+              <w:left w:type="dxa" w:w="110"/>
+              <w:bottom w:type="dxa" w:w="55"/>
+              <w:right w:type="dxa" w:w="110"/>
+            </w:tcMar>
+          </w:tcPr>
+          <w:p>
+            <w:r>
+              <w:rPr>
+                <w:b w:val="false"/>
+                <w:bCs w:val="false"/>
+                <w:color w:val="222222"/>
+                <w:sz w:val="20"/>
+                <w:szCs w:val="20"/>
+              </w:rPr>
+              <w:t xml:space="preserve">Toda la operación organizada y lista para reportar.</w:t>
+            </w:r>
+          </w:p>
+        </w:tc>
+      </w:tr>
+      <w:tr>
+        <w:tc>
+          <w:tcPr>
+            <w:tcW w:type="dxa" w:w="3000"/>
+            <w:shd w:fill="FFFFFF" w:color="auto" w:val="clear"/>
+            <w:tcMar>
+              <w:top w:type="dxa" w:w="55"/>
+              <w:left w:type="dxa" w:w="110"/>
+              <w:bottom w:type="dxa" w:w="55"/>
+              <w:right w:type="dxa" w:w="110"/>
+            </w:tcMar>
+          </w:tcPr>
+          <w:p>
+            <w:r>
+              <w:rPr>
+                <w:b/>
+                <w:bCs/>
+                <w:color w:val="222222"/>
+                <w:sz w:val="20"/>
+                <w:szCs w:val="20"/>
+              </w:rPr>
+              <w:t xml:space="preserve">Tablero e indicadores</w:t>
+            </w:r>
+          </w:p>
+        </w:tc>
+        <w:tc>
+          <w:tcPr>
+            <w:tcW w:type="dxa" w:w="6360"/>
+            <w:shd w:fill="FFFFFF" w:color="auto" w:val="clear"/>
+            <w:tcMar>
+              <w:top w:type="dxa" w:w="55"/>
+              <w:left w:type="dxa" w:w="110"/>
+              <w:bottom w:type="dxa" w:w="55"/>
+              <w:right w:type="dxa" w:w="110"/>
+            </w:tcMar>
+          </w:tcPr>
+          <w:p>
+            <w:r>
+              <w:rPr>
+                <w:b w:val="false"/>
+                <w:bCs w:val="false"/>
+                <w:color w:val="222222"/>
+                <w:sz w:val="20"/>
+                <w:szCs w:val="20"/>
+              </w:rPr>
               <w:t xml:space="preserve">Pulso diario de la operación de un vistazo.</w:t>
             </w:r>
           </w:p>
@@ -1305,7 +1473,7 @@
           <w:sz w:val="21"/>
           <w:szCs w:val="21"/>
         </w:rPr>
-        <w:t xml:space="preserve">el cliente, sus sitios y los puntos de control (con su QR impreso).</w:t>
+        <w:t xml:space="preserve">el cliente, sus sitios y los puntos de control (con su QR impreso), y se dan de alta las cámaras del sitio (buscándolas alrededor o con el NVR del cliente).</w:t>
       </w:r>
     </w:p>
     <w:p>
@@ -1361,7 +1529,7 @@
           <w:sz w:val="21"/>
           <w:szCs w:val="21"/>
         </w:rPr>
-        <w:t xml:space="preserve">en campo: escanea los QR, levanta incidentes y evidencias, atiende tareas y, ante un riesgo, envía una alerta con video.</w:t>
+        <w:t xml:space="preserve">en campo: lee los puntos por QR o NFC, levanta incidentes y evidencias, atiende tareas y, ante un riesgo, envía una alerta con video.</w:t>
       </w:r>
     </w:p>
     <w:p>
@@ -1389,7 +1557,7 @@
           <w:sz w:val="21"/>
           <w:szCs w:val="21"/>
         </w:rPr>
-        <w:t xml:space="preserve">en vivo, despacha emergencias y supervisa los rondines.</w:t>
+        <w:t xml:space="preserve">en vivo (guardias y cámaras en el mapa), despacha emergencias con su video, vigila el muro de cámaras y supervisa los rondines.</w:t>
       </w:r>
     </w:p>
     <w:p>
@@ -1589,6 +1757,40 @@
           <w:sz w:val="21"/>
           <w:szCs w:val="21"/>
         </w:rPr>
+        <w:t xml:space="preserve">Videovigilancia + rastreo en un solo mapa. </w:t>
+      </w:r>
+      <w:r>
+        <w:rPr>
+          <w:color w:val="222222"/>
+          <w:sz w:val="21"/>
+          <w:szCs w:val="21"/>
+        </w:rPr>
+        <w:t xml:space="preserve">Cámaras fijas del sitio y guardias en vivo, juntos, con acceso inmediato al video del entorno de una incidencia.</w:t>
+      </w:r>
+    </w:p>
+    <w:p>
+      <w:pPr>
+        <w:spacing w:after="80" w:line="272"/>
+        <w:ind w:left="360" w:hanging="300"/>
+      </w:pPr>
+      <w:r>
+        <w:rPr>
+          <w:b/>
+          <w:bCs/>
+          <w:color w:val="3E7470"/>
+          <w:sz w:val="22"/>
+          <w:szCs w:val="22"/>
+        </w:rPr>
+        <w:t xml:space="preserve">✓  </w:t>
+      </w:r>
+      <w:r>
+        <w:rPr>
+          <w:b/>
+          <w:bCs/>
+          <w:color w:val="222222"/>
+          <w:sz w:val="21"/>
+          <w:szCs w:val="21"/>
+        </w:rPr>
         <w:t xml:space="preserve">Tiempo real de verdad. </w:t>
       </w:r>
       <w:r>
@@ -1598,6 +1800,40 @@
           <w:szCs w:val="21"/>
         </w:rPr>
         <w:t xml:space="preserve">GPS, alertas, video y despacho en vivo.</w:t>
+      </w:r>
+    </w:p>
+    <w:p>
+      <w:pPr>
+        <w:spacing w:after="80" w:line="272"/>
+        <w:ind w:left="360" w:hanging="300"/>
+      </w:pPr>
+      <w:r>
+        <w:rPr>
+          <w:b/>
+          <w:bCs/>
+          <w:color w:val="3E7470"/>
+          <w:sz w:val="22"/>
+          <w:szCs w:val="22"/>
+        </w:rPr>
+        <w:t xml:space="preserve">✓  </w:t>
+      </w:r>
+      <w:r>
+        <w:rPr>
+          <w:b/>
+          <w:bCs/>
+          <w:color w:val="222222"/>
+          <w:sz w:val="21"/>
+          <w:szCs w:val="21"/>
+        </w:rPr>
+        <w:t xml:space="preserve">Inteligencia artificial aplicada. </w:t>
+      </w:r>
+      <w:r>
+        <w:rPr>
+          <w:color w:val="222222"/>
+          <w:sz w:val="21"/>
+          <w:szCs w:val="21"/>
+        </w:rPr>
+        <w:t xml:space="preserve">Un asistente que convierte los registros en respuestas útiles para la operación y el reporte al cliente.</w:t>
       </w:r>
     </w:p>
     <w:p>
@@ -1932,7 +2168,7 @@
           <w:sz w:val="16"/>
           <w:szCs w:val="16"/>
         </w:rPr>
-        <w:t xml:space="preserve">SGS — Sistema de Gestión de Seguridad · Documento comercial · v1.0</w:t>
+        <w:t xml:space="preserve">SGS — Sistema de Gestión de Seguridad · Documento comercial · v1.1</w:t>
       </w:r>
     </w:p>
     <w:sectPr>

</xml_diff>